<commit_message>
Word proposal: cell margins and table layout in schema order (Word rejects them otherwise)
Co-Authored-By: Claude Opus 5.5 <noreply@anthropic.com>
Claude-Session: https://claude.ai/code/session_01SHDqfgFcGDQJHU7goabWW4
</commit_message>
<xml_diff>
--- a/ai4qi/demo/sepsis-audit-proposal.docx
+++ b/ai4qi/demo/sepsis-audit-proposal.docx
@@ -47,7 +47,6 @@
     <w:tbl>
       <w:tblPr>
         <w:tblW w:w="9638" w:type="dxa"/>
-        <w:tblLayout w:type="fixed"/>
         <w:tblBorders>
           <w:top w:val="single" w:sz="4" w:space="0" w:color="E4E1D8"/>
           <w:left w:val="single" w:sz="4" w:space="0" w:color="E4E1D8"/>
@@ -56,6 +55,7 @@
           <w:insideH w:val="single" w:sz="4" w:space="0" w:color="E4E1D8"/>
           <w:insideV w:val="single" w:sz="4" w:space="0" w:color="E4E1D8"/>
         </w:tblBorders>
+        <w:tblLayout w:type="fixed"/>
         <w:tblLook w:val="04A0" w:firstRow="1" w:lastRow="0" w:firstColumn="0" w:lastColumn="0" w:noHBand="1" w:noVBand="1"/>
       </w:tblPr>
       <w:tblGrid>
@@ -74,8 +74,8 @@
             <w:shd w:val="clear" w:color="auto" w:fill="F6F4EE"/>
             <w:tcMar>
               <w:top w:w="70" w:type="dxa"/>
-              <w:bottom w:w="70" w:type="dxa"/>
-              <w:left w:w="100" w:type="dxa"/>
+              <w:left w:w="100" w:type="dxa"/>
+              <w:bottom w:w="70" w:type="dxa"/>
               <w:right w:w="100" w:type="dxa"/>
             </w:tcMar>
             <w:vAlign w:val="center"/>
@@ -101,8 +101,8 @@
             <w:tcW w:w="2919" w:type="dxa"/>
             <w:tcMar>
               <w:top w:w="70" w:type="dxa"/>
-              <w:bottom w:w="70" w:type="dxa"/>
-              <w:left w:w="100" w:type="dxa"/>
+              <w:left w:w="100" w:type="dxa"/>
+              <w:bottom w:w="70" w:type="dxa"/>
               <w:right w:w="100" w:type="dxa"/>
             </w:tcMar>
             <w:vAlign w:val="center"/>
@@ -127,8 +127,8 @@
             <w:shd w:val="clear" w:color="auto" w:fill="F6F4EE"/>
             <w:tcMar>
               <w:top w:w="70" w:type="dxa"/>
-              <w:bottom w:w="70" w:type="dxa"/>
-              <w:left w:w="100" w:type="dxa"/>
+              <w:left w:w="100" w:type="dxa"/>
+              <w:bottom w:w="70" w:type="dxa"/>
               <w:right w:w="100" w:type="dxa"/>
             </w:tcMar>
             <w:vAlign w:val="center"/>
@@ -154,8 +154,8 @@
             <w:tcW w:w="2919" w:type="dxa"/>
             <w:tcMar>
               <w:top w:w="70" w:type="dxa"/>
-              <w:bottom w:w="70" w:type="dxa"/>
-              <w:left w:w="100" w:type="dxa"/>
+              <w:left w:w="100" w:type="dxa"/>
+              <w:bottom w:w="70" w:type="dxa"/>
               <w:right w:w="100" w:type="dxa"/>
             </w:tcMar>
             <w:vAlign w:val="center"/>
@@ -185,8 +185,8 @@
             <w:shd w:val="clear" w:color="auto" w:fill="F6F4EE"/>
             <w:tcMar>
               <w:top w:w="70" w:type="dxa"/>
-              <w:bottom w:w="70" w:type="dxa"/>
-              <w:left w:w="100" w:type="dxa"/>
+              <w:left w:w="100" w:type="dxa"/>
+              <w:bottom w:w="70" w:type="dxa"/>
               <w:right w:w="100" w:type="dxa"/>
             </w:tcMar>
             <w:vAlign w:val="center"/>
@@ -212,8 +212,8 @@
             <w:tcW w:w="2919" w:type="dxa"/>
             <w:tcMar>
               <w:top w:w="70" w:type="dxa"/>
-              <w:bottom w:w="70" w:type="dxa"/>
-              <w:left w:w="100" w:type="dxa"/>
+              <w:left w:w="100" w:type="dxa"/>
+              <w:bottom w:w="70" w:type="dxa"/>
               <w:right w:w="100" w:type="dxa"/>
             </w:tcMar>
             <w:vAlign w:val="center"/>
@@ -238,8 +238,8 @@
             <w:shd w:val="clear" w:color="auto" w:fill="F6F4EE"/>
             <w:tcMar>
               <w:top w:w="70" w:type="dxa"/>
-              <w:bottom w:w="70" w:type="dxa"/>
-              <w:left w:w="100" w:type="dxa"/>
+              <w:left w:w="100" w:type="dxa"/>
+              <w:bottom w:w="70" w:type="dxa"/>
               <w:right w:w="100" w:type="dxa"/>
             </w:tcMar>
             <w:vAlign w:val="center"/>
@@ -265,8 +265,8 @@
             <w:tcW w:w="2919" w:type="dxa"/>
             <w:tcMar>
               <w:top w:w="70" w:type="dxa"/>
-              <w:bottom w:w="70" w:type="dxa"/>
-              <w:left w:w="100" w:type="dxa"/>
+              <w:left w:w="100" w:type="dxa"/>
+              <w:bottom w:w="70" w:type="dxa"/>
               <w:right w:w="100" w:type="dxa"/>
             </w:tcMar>
             <w:vAlign w:val="center"/>
@@ -296,8 +296,8 @@
             <w:shd w:val="clear" w:color="auto" w:fill="F6F4EE"/>
             <w:tcMar>
               <w:top w:w="70" w:type="dxa"/>
-              <w:bottom w:w="70" w:type="dxa"/>
-              <w:left w:w="100" w:type="dxa"/>
+              <w:left w:w="100" w:type="dxa"/>
+              <w:bottom w:w="70" w:type="dxa"/>
               <w:right w:w="100" w:type="dxa"/>
             </w:tcMar>
             <w:vAlign w:val="center"/>
@@ -323,8 +323,8 @@
             <w:tcW w:w="2919" w:type="dxa"/>
             <w:tcMar>
               <w:top w:w="70" w:type="dxa"/>
-              <w:bottom w:w="70" w:type="dxa"/>
-              <w:left w:w="100" w:type="dxa"/>
+              <w:left w:w="100" w:type="dxa"/>
+              <w:bottom w:w="70" w:type="dxa"/>
               <w:right w:w="100" w:type="dxa"/>
             </w:tcMar>
             <w:vAlign w:val="center"/>
@@ -349,8 +349,8 @@
             <w:shd w:val="clear" w:color="auto" w:fill="F6F4EE"/>
             <w:tcMar>
               <w:top w:w="70" w:type="dxa"/>
-              <w:bottom w:w="70" w:type="dxa"/>
-              <w:left w:w="100" w:type="dxa"/>
+              <w:left w:w="100" w:type="dxa"/>
+              <w:bottom w:w="70" w:type="dxa"/>
               <w:right w:w="100" w:type="dxa"/>
             </w:tcMar>
             <w:vAlign w:val="center"/>
@@ -376,8 +376,8 @@
             <w:tcW w:w="2919" w:type="dxa"/>
             <w:tcMar>
               <w:top w:w="70" w:type="dxa"/>
-              <w:bottom w:w="70" w:type="dxa"/>
-              <w:left w:w="100" w:type="dxa"/>
+              <w:left w:w="100" w:type="dxa"/>
+              <w:bottom w:w="70" w:type="dxa"/>
               <w:right w:w="100" w:type="dxa"/>
             </w:tcMar>
             <w:vAlign w:val="center"/>
@@ -407,8 +407,8 @@
             <w:shd w:val="clear" w:color="auto" w:fill="F6F4EE"/>
             <w:tcMar>
               <w:top w:w="70" w:type="dxa"/>
-              <w:bottom w:w="70" w:type="dxa"/>
-              <w:left w:w="100" w:type="dxa"/>
+              <w:left w:w="100" w:type="dxa"/>
+              <w:bottom w:w="70" w:type="dxa"/>
               <w:right w:w="100" w:type="dxa"/>
             </w:tcMar>
             <w:vAlign w:val="center"/>
@@ -434,8 +434,8 @@
             <w:tcW w:w="2919" w:type="dxa"/>
             <w:tcMar>
               <w:top w:w="70" w:type="dxa"/>
-              <w:bottom w:w="70" w:type="dxa"/>
-              <w:left w:w="100" w:type="dxa"/>
+              <w:left w:w="100" w:type="dxa"/>
+              <w:bottom w:w="70" w:type="dxa"/>
               <w:right w:w="100" w:type="dxa"/>
             </w:tcMar>
             <w:vAlign w:val="center"/>
@@ -460,8 +460,8 @@
             <w:shd w:val="clear" w:color="auto" w:fill="F6F4EE"/>
             <w:tcMar>
               <w:top w:w="70" w:type="dxa"/>
-              <w:bottom w:w="70" w:type="dxa"/>
-              <w:left w:w="100" w:type="dxa"/>
+              <w:left w:w="100" w:type="dxa"/>
+              <w:bottom w:w="70" w:type="dxa"/>
               <w:right w:w="100" w:type="dxa"/>
             </w:tcMar>
             <w:vAlign w:val="center"/>
@@ -487,8 +487,8 @@
             <w:tcW w:w="2919" w:type="dxa"/>
             <w:tcMar>
               <w:top w:w="70" w:type="dxa"/>
-              <w:bottom w:w="70" w:type="dxa"/>
-              <w:left w:w="100" w:type="dxa"/>
+              <w:left w:w="100" w:type="dxa"/>
+              <w:bottom w:w="70" w:type="dxa"/>
               <w:right w:w="100" w:type="dxa"/>
             </w:tcMar>
             <w:vAlign w:val="center"/>
@@ -782,7 +782,6 @@
     <w:tbl>
       <w:tblPr>
         <w:tblW w:w="9636" w:type="dxa"/>
-        <w:tblLayout w:type="fixed"/>
         <w:tblBorders>
           <w:top w:val="single" w:sz="4" w:space="0" w:color="C8C8C8"/>
           <w:left w:val="single" w:sz="4" w:space="0" w:color="C8C8C8"/>
@@ -791,6 +790,7 @@
           <w:insideH w:val="single" w:sz="4" w:space="0" w:color="C8C8C8"/>
           <w:insideV w:val="single" w:sz="4" w:space="0" w:color="C8C8C8"/>
         </w:tblBorders>
+        <w:tblLayout w:type="fixed"/>
         <w:tblLook w:val="04A0" w:firstRow="1" w:lastRow="0" w:firstColumn="0" w:lastColumn="0" w:noHBand="1" w:noVBand="1"/>
       </w:tblPr>
       <w:tblGrid>
@@ -815,8 +815,8 @@
             <w:shd w:val="clear" w:color="auto" w:fill="EDEDED"/>
             <w:tcMar>
               <w:top w:w="30" w:type="dxa"/>
+              <w:left w:w="100" w:type="dxa"/>
               <w:bottom w:w="30" w:type="dxa"/>
-              <w:left w:w="100" w:type="dxa"/>
               <w:right w:w="100" w:type="dxa"/>
             </w:tcMar>
             <w:vAlign w:val="top"/>
@@ -833,8 +833,8 @@
             <w:shd w:val="clear" w:color="auto" w:fill="EDEDED"/>
             <w:tcMar>
               <w:top w:w="30" w:type="dxa"/>
+              <w:left w:w="100" w:type="dxa"/>
               <w:bottom w:w="30" w:type="dxa"/>
-              <w:left w:w="100" w:type="dxa"/>
               <w:right w:w="100" w:type="dxa"/>
             </w:tcMar>
             <w:vAlign w:val="top"/>
@@ -860,8 +860,8 @@
             <w:shd w:val="clear" w:color="auto" w:fill="EDEDED"/>
             <w:tcMar>
               <w:top w:w="30" w:type="dxa"/>
+              <w:left w:w="100" w:type="dxa"/>
               <w:bottom w:w="30" w:type="dxa"/>
-              <w:left w:w="100" w:type="dxa"/>
               <w:right w:w="100" w:type="dxa"/>
             </w:tcMar>
             <w:vAlign w:val="top"/>
@@ -887,8 +887,8 @@
             <w:shd w:val="clear" w:color="auto" w:fill="EDEDED"/>
             <w:tcMar>
               <w:top w:w="30" w:type="dxa"/>
+              <w:left w:w="100" w:type="dxa"/>
               <w:bottom w:w="30" w:type="dxa"/>
-              <w:left w:w="100" w:type="dxa"/>
               <w:right w:w="100" w:type="dxa"/>
             </w:tcMar>
             <w:vAlign w:val="top"/>
@@ -914,8 +914,8 @@
             <w:shd w:val="clear" w:color="auto" w:fill="EDEDED"/>
             <w:tcMar>
               <w:top w:w="30" w:type="dxa"/>
+              <w:left w:w="100" w:type="dxa"/>
               <w:bottom w:w="30" w:type="dxa"/>
-              <w:left w:w="100" w:type="dxa"/>
               <w:right w:w="100" w:type="dxa"/>
             </w:tcMar>
             <w:vAlign w:val="top"/>
@@ -941,8 +941,8 @@
             <w:shd w:val="clear" w:color="auto" w:fill="EDEDED"/>
             <w:tcMar>
               <w:top w:w="30" w:type="dxa"/>
+              <w:left w:w="100" w:type="dxa"/>
               <w:bottom w:w="30" w:type="dxa"/>
-              <w:left w:w="100" w:type="dxa"/>
               <w:right w:w="100" w:type="dxa"/>
             </w:tcMar>
             <w:vAlign w:val="top"/>
@@ -968,8 +968,8 @@
             <w:shd w:val="clear" w:color="auto" w:fill="EDEDED"/>
             <w:tcMar>
               <w:top w:w="30" w:type="dxa"/>
+              <w:left w:w="100" w:type="dxa"/>
               <w:bottom w:w="30" w:type="dxa"/>
-              <w:left w:w="100" w:type="dxa"/>
               <w:right w:w="100" w:type="dxa"/>
             </w:tcMar>
             <w:vAlign w:val="top"/>
@@ -995,8 +995,8 @@
             <w:shd w:val="clear" w:color="auto" w:fill="EDEDED"/>
             <w:tcMar>
               <w:top w:w="30" w:type="dxa"/>
+              <w:left w:w="100" w:type="dxa"/>
               <w:bottom w:w="30" w:type="dxa"/>
-              <w:left w:w="100" w:type="dxa"/>
               <w:right w:w="100" w:type="dxa"/>
             </w:tcMar>
             <w:vAlign w:val="top"/>
@@ -1022,8 +1022,8 @@
             <w:shd w:val="clear" w:color="auto" w:fill="EDEDED"/>
             <w:tcMar>
               <w:top w:w="30" w:type="dxa"/>
+              <w:left w:w="100" w:type="dxa"/>
               <w:bottom w:w="30" w:type="dxa"/>
-              <w:left w:w="100" w:type="dxa"/>
               <w:right w:w="100" w:type="dxa"/>
             </w:tcMar>
             <w:vAlign w:val="top"/>
@@ -1054,8 +1054,8 @@
             <w:shd w:val="clear" w:color="auto" w:fill="EDEDED"/>
             <w:tcMar>
               <w:top w:w="70" w:type="dxa"/>
-              <w:bottom w:w="70" w:type="dxa"/>
-              <w:left w:w="100" w:type="dxa"/>
+              <w:left w:w="100" w:type="dxa"/>
+              <w:bottom w:w="70" w:type="dxa"/>
               <w:right w:w="100" w:type="dxa"/>
             </w:tcMar>
             <w:vAlign w:val="top"/>
@@ -1081,8 +1081,8 @@
             <w:shd w:val="clear" w:color="auto" w:fill="3346D3"/>
             <w:tcMar>
               <w:top w:w="70" w:type="dxa"/>
-              <w:bottom w:w="70" w:type="dxa"/>
-              <w:left w:w="100" w:type="dxa"/>
+              <w:left w:w="100" w:type="dxa"/>
+              <w:bottom w:w="70" w:type="dxa"/>
               <w:right w:w="100" w:type="dxa"/>
             </w:tcMar>
             <w:vAlign w:val="top"/>
@@ -1108,8 +1108,8 @@
             <w:shd w:val="clear" w:color="auto" w:fill="3346D3"/>
             <w:tcMar>
               <w:top w:w="70" w:type="dxa"/>
-              <w:bottom w:w="70" w:type="dxa"/>
-              <w:left w:w="100" w:type="dxa"/>
+              <w:left w:w="100" w:type="dxa"/>
+              <w:bottom w:w="70" w:type="dxa"/>
               <w:right w:w="100" w:type="dxa"/>
             </w:tcMar>
             <w:vAlign w:val="top"/>
@@ -1135,8 +1135,8 @@
             <w:shd w:val="clear" w:color="auto" w:fill="3346D3"/>
             <w:tcMar>
               <w:top w:w="70" w:type="dxa"/>
-              <w:bottom w:w="70" w:type="dxa"/>
-              <w:left w:w="100" w:type="dxa"/>
+              <w:left w:w="100" w:type="dxa"/>
+              <w:bottom w:w="70" w:type="dxa"/>
               <w:right w:w="100" w:type="dxa"/>
             </w:tcMar>
             <w:vAlign w:val="top"/>
@@ -1162,8 +1162,8 @@
             <w:shd w:val="clear" w:color="auto" w:fill="3346D3"/>
             <w:tcMar>
               <w:top w:w="70" w:type="dxa"/>
-              <w:bottom w:w="70" w:type="dxa"/>
-              <w:left w:w="100" w:type="dxa"/>
+              <w:left w:w="100" w:type="dxa"/>
+              <w:bottom w:w="70" w:type="dxa"/>
               <w:right w:w="100" w:type="dxa"/>
             </w:tcMar>
             <w:vAlign w:val="top"/>
@@ -1189,8 +1189,8 @@
             <w:shd w:val="clear" w:color="auto" w:fill="3346D3"/>
             <w:tcMar>
               <w:top w:w="70" w:type="dxa"/>
-              <w:bottom w:w="70" w:type="dxa"/>
-              <w:left w:w="100" w:type="dxa"/>
+              <w:left w:w="100" w:type="dxa"/>
+              <w:bottom w:w="70" w:type="dxa"/>
               <w:right w:w="100" w:type="dxa"/>
             </w:tcMar>
             <w:vAlign w:val="top"/>
@@ -1216,8 +1216,8 @@
             <w:shd w:val="clear" w:color="auto" w:fill="3346D3"/>
             <w:tcMar>
               <w:top w:w="70" w:type="dxa"/>
-              <w:bottom w:w="70" w:type="dxa"/>
-              <w:left w:w="100" w:type="dxa"/>
+              <w:left w:w="100" w:type="dxa"/>
+              <w:bottom w:w="70" w:type="dxa"/>
               <w:right w:w="100" w:type="dxa"/>
             </w:tcMar>
             <w:vAlign w:val="top"/>
@@ -1243,8 +1243,8 @@
             <w:shd w:val="clear" w:color="auto" w:fill="3346D3"/>
             <w:tcMar>
               <w:top w:w="70" w:type="dxa"/>
-              <w:bottom w:w="70" w:type="dxa"/>
-              <w:left w:w="100" w:type="dxa"/>
+              <w:left w:w="100" w:type="dxa"/>
+              <w:bottom w:w="70" w:type="dxa"/>
               <w:right w:w="100" w:type="dxa"/>
             </w:tcMar>
             <w:vAlign w:val="top"/>
@@ -1270,8 +1270,8 @@
             <w:shd w:val="clear" w:color="auto" w:fill="3346D3"/>
             <w:tcMar>
               <w:top w:w="70" w:type="dxa"/>
-              <w:bottom w:w="70" w:type="dxa"/>
-              <w:left w:w="100" w:type="dxa"/>
+              <w:left w:w="100" w:type="dxa"/>
+              <w:bottom w:w="70" w:type="dxa"/>
               <w:right w:w="100" w:type="dxa"/>
             </w:tcMar>
             <w:vAlign w:val="top"/>
@@ -1302,8 +1302,8 @@
             <w:shd w:val="clear" w:color="auto" w:fill="EDEDED"/>
             <w:tcMar>
               <w:top w:w="70" w:type="dxa"/>
-              <w:bottom w:w="70" w:type="dxa"/>
-              <w:left w:w="100" w:type="dxa"/>
+              <w:left w:w="100" w:type="dxa"/>
+              <w:bottom w:w="70" w:type="dxa"/>
               <w:right w:w="100" w:type="dxa"/>
             </w:tcMar>
             <w:vAlign w:val="top"/>
@@ -1328,8 +1328,8 @@
             <w:tcW w:w="1157" w:type="dxa"/>
             <w:tcMar>
               <w:top w:w="70" w:type="dxa"/>
-              <w:bottom w:w="70" w:type="dxa"/>
-              <w:left w:w="100" w:type="dxa"/>
+              <w:left w:w="100" w:type="dxa"/>
+              <w:bottom w:w="70" w:type="dxa"/>
               <w:right w:w="100" w:type="dxa"/>
             </w:tcMar>
             <w:vAlign w:val="top"/>
@@ -1354,8 +1354,8 @@
             <w:tcW w:w="1157" w:type="dxa"/>
             <w:tcMar>
               <w:top w:w="70" w:type="dxa"/>
-              <w:bottom w:w="70" w:type="dxa"/>
-              <w:left w:w="100" w:type="dxa"/>
+              <w:left w:w="100" w:type="dxa"/>
+              <w:bottom w:w="70" w:type="dxa"/>
               <w:right w:w="100" w:type="dxa"/>
             </w:tcMar>
             <w:vAlign w:val="top"/>
@@ -1380,8 +1380,8 @@
             <w:tcW w:w="1157" w:type="dxa"/>
             <w:tcMar>
               <w:top w:w="70" w:type="dxa"/>
-              <w:bottom w:w="70" w:type="dxa"/>
-              <w:left w:w="100" w:type="dxa"/>
+              <w:left w:w="100" w:type="dxa"/>
+              <w:bottom w:w="70" w:type="dxa"/>
               <w:right w:w="100" w:type="dxa"/>
             </w:tcMar>
             <w:vAlign w:val="top"/>
@@ -1406,8 +1406,8 @@
             <w:tcW w:w="1157" w:type="dxa"/>
             <w:tcMar>
               <w:top w:w="70" w:type="dxa"/>
-              <w:bottom w:w="70" w:type="dxa"/>
-              <w:left w:w="100" w:type="dxa"/>
+              <w:left w:w="100" w:type="dxa"/>
+              <w:bottom w:w="70" w:type="dxa"/>
               <w:right w:w="100" w:type="dxa"/>
             </w:tcMar>
             <w:vAlign w:val="top"/>
@@ -1432,8 +1432,8 @@
             <w:tcW w:w="1157" w:type="dxa"/>
             <w:tcMar>
               <w:top w:w="70" w:type="dxa"/>
-              <w:bottom w:w="70" w:type="dxa"/>
-              <w:left w:w="100" w:type="dxa"/>
+              <w:left w:w="100" w:type="dxa"/>
+              <w:bottom w:w="70" w:type="dxa"/>
               <w:right w:w="100" w:type="dxa"/>
             </w:tcMar>
             <w:vAlign w:val="top"/>
@@ -1458,8 +1458,8 @@
             <w:tcW w:w="1157" w:type="dxa"/>
             <w:tcMar>
               <w:top w:w="70" w:type="dxa"/>
-              <w:bottom w:w="70" w:type="dxa"/>
-              <w:left w:w="100" w:type="dxa"/>
+              <w:left w:w="100" w:type="dxa"/>
+              <w:bottom w:w="70" w:type="dxa"/>
               <w:right w:w="100" w:type="dxa"/>
             </w:tcMar>
             <w:vAlign w:val="top"/>
@@ -1484,8 +1484,8 @@
             <w:tcW w:w="1157" w:type="dxa"/>
             <w:tcMar>
               <w:top w:w="70" w:type="dxa"/>
-              <w:bottom w:w="70" w:type="dxa"/>
-              <w:left w:w="100" w:type="dxa"/>
+              <w:left w:w="100" w:type="dxa"/>
+              <w:bottom w:w="70" w:type="dxa"/>
               <w:right w:w="100" w:type="dxa"/>
             </w:tcMar>
             <w:vAlign w:val="top"/>
@@ -1510,8 +1510,8 @@
             <w:tcW w:w="1157" w:type="dxa"/>
             <w:tcMar>
               <w:top w:w="70" w:type="dxa"/>
-              <w:bottom w:w="70" w:type="dxa"/>
-              <w:left w:w="100" w:type="dxa"/>
+              <w:left w:w="100" w:type="dxa"/>
+              <w:bottom w:w="70" w:type="dxa"/>
               <w:right w:w="100" w:type="dxa"/>
             </w:tcMar>
             <w:vAlign w:val="top"/>
@@ -1542,8 +1542,8 @@
             <w:shd w:val="clear" w:color="auto" w:fill="EDEDED"/>
             <w:tcMar>
               <w:top w:w="70" w:type="dxa"/>
-              <w:bottom w:w="70" w:type="dxa"/>
-              <w:left w:w="100" w:type="dxa"/>
+              <w:left w:w="100" w:type="dxa"/>
+              <w:bottom w:w="70" w:type="dxa"/>
               <w:right w:w="100" w:type="dxa"/>
             </w:tcMar>
             <w:vAlign w:val="top"/>
@@ -1568,127 +1568,127 @@
             <w:tcW w:w="1157" w:type="dxa"/>
             <w:tcMar>
               <w:top w:w="70" w:type="dxa"/>
-              <w:bottom w:w="70" w:type="dxa"/>
-              <w:left w:w="100" w:type="dxa"/>
-              <w:right w:w="100" w:type="dxa"/>
-            </w:tcMar>
-            <w:vAlign w:val="top"/>
-          </w:tcPr>
-          <w:p>
-            <w:pPr>
-              <w:spacing w:before="0" w:after="0"/>
-            </w:pPr>
-          </w:p>
-        </w:tc>
-        <w:tc>
-          <w:tcPr>
-            <w:tcW w:w="1157" w:type="dxa"/>
-            <w:tcMar>
-              <w:top w:w="70" w:type="dxa"/>
-              <w:bottom w:w="70" w:type="dxa"/>
-              <w:left w:w="100" w:type="dxa"/>
-              <w:right w:w="100" w:type="dxa"/>
-            </w:tcMar>
-            <w:vAlign w:val="top"/>
-          </w:tcPr>
-          <w:p>
-            <w:pPr>
-              <w:spacing w:before="0" w:after="0"/>
-            </w:pPr>
-          </w:p>
-        </w:tc>
-        <w:tc>
-          <w:tcPr>
-            <w:tcW w:w="1157" w:type="dxa"/>
-            <w:tcMar>
-              <w:top w:w="70" w:type="dxa"/>
-              <w:bottom w:w="70" w:type="dxa"/>
-              <w:left w:w="100" w:type="dxa"/>
-              <w:right w:w="100" w:type="dxa"/>
-            </w:tcMar>
-            <w:vAlign w:val="top"/>
-          </w:tcPr>
-          <w:p>
-            <w:pPr>
-              <w:spacing w:before="0" w:after="0"/>
-            </w:pPr>
-          </w:p>
-        </w:tc>
-        <w:tc>
-          <w:tcPr>
-            <w:tcW w:w="1157" w:type="dxa"/>
-            <w:tcMar>
-              <w:top w:w="70" w:type="dxa"/>
-              <w:bottom w:w="70" w:type="dxa"/>
-              <w:left w:w="100" w:type="dxa"/>
-              <w:right w:w="100" w:type="dxa"/>
-            </w:tcMar>
-            <w:vAlign w:val="top"/>
-          </w:tcPr>
-          <w:p>
-            <w:pPr>
-              <w:spacing w:before="0" w:after="0"/>
-            </w:pPr>
-          </w:p>
-        </w:tc>
-        <w:tc>
-          <w:tcPr>
-            <w:tcW w:w="1157" w:type="dxa"/>
-            <w:tcMar>
-              <w:top w:w="70" w:type="dxa"/>
-              <w:bottom w:w="70" w:type="dxa"/>
-              <w:left w:w="100" w:type="dxa"/>
-              <w:right w:w="100" w:type="dxa"/>
-            </w:tcMar>
-            <w:vAlign w:val="top"/>
-          </w:tcPr>
-          <w:p>
-            <w:pPr>
-              <w:spacing w:before="0" w:after="0"/>
-            </w:pPr>
-          </w:p>
-        </w:tc>
-        <w:tc>
-          <w:tcPr>
-            <w:tcW w:w="1157" w:type="dxa"/>
-            <w:tcMar>
-              <w:top w:w="70" w:type="dxa"/>
-              <w:bottom w:w="70" w:type="dxa"/>
-              <w:left w:w="100" w:type="dxa"/>
-              <w:right w:w="100" w:type="dxa"/>
-            </w:tcMar>
-            <w:vAlign w:val="top"/>
-          </w:tcPr>
-          <w:p>
-            <w:pPr>
-              <w:spacing w:before="0" w:after="0"/>
-            </w:pPr>
-          </w:p>
-        </w:tc>
-        <w:tc>
-          <w:tcPr>
-            <w:tcW w:w="1157" w:type="dxa"/>
-            <w:tcMar>
-              <w:top w:w="70" w:type="dxa"/>
-              <w:bottom w:w="70" w:type="dxa"/>
-              <w:left w:w="100" w:type="dxa"/>
-              <w:right w:w="100" w:type="dxa"/>
-            </w:tcMar>
-            <w:vAlign w:val="top"/>
-          </w:tcPr>
-          <w:p>
-            <w:pPr>
-              <w:spacing w:before="0" w:after="0"/>
-            </w:pPr>
-          </w:p>
-        </w:tc>
-        <w:tc>
-          <w:tcPr>
-            <w:tcW w:w="1157" w:type="dxa"/>
-            <w:tcMar>
-              <w:top w:w="70" w:type="dxa"/>
-              <w:bottom w:w="70" w:type="dxa"/>
-              <w:left w:w="100" w:type="dxa"/>
+              <w:left w:w="100" w:type="dxa"/>
+              <w:bottom w:w="70" w:type="dxa"/>
+              <w:right w:w="100" w:type="dxa"/>
+            </w:tcMar>
+            <w:vAlign w:val="top"/>
+          </w:tcPr>
+          <w:p>
+            <w:pPr>
+              <w:spacing w:before="0" w:after="0"/>
+            </w:pPr>
+          </w:p>
+        </w:tc>
+        <w:tc>
+          <w:tcPr>
+            <w:tcW w:w="1157" w:type="dxa"/>
+            <w:tcMar>
+              <w:top w:w="70" w:type="dxa"/>
+              <w:left w:w="100" w:type="dxa"/>
+              <w:bottom w:w="70" w:type="dxa"/>
+              <w:right w:w="100" w:type="dxa"/>
+            </w:tcMar>
+            <w:vAlign w:val="top"/>
+          </w:tcPr>
+          <w:p>
+            <w:pPr>
+              <w:spacing w:before="0" w:after="0"/>
+            </w:pPr>
+          </w:p>
+        </w:tc>
+        <w:tc>
+          <w:tcPr>
+            <w:tcW w:w="1157" w:type="dxa"/>
+            <w:tcMar>
+              <w:top w:w="70" w:type="dxa"/>
+              <w:left w:w="100" w:type="dxa"/>
+              <w:bottom w:w="70" w:type="dxa"/>
+              <w:right w:w="100" w:type="dxa"/>
+            </w:tcMar>
+            <w:vAlign w:val="top"/>
+          </w:tcPr>
+          <w:p>
+            <w:pPr>
+              <w:spacing w:before="0" w:after="0"/>
+            </w:pPr>
+          </w:p>
+        </w:tc>
+        <w:tc>
+          <w:tcPr>
+            <w:tcW w:w="1157" w:type="dxa"/>
+            <w:tcMar>
+              <w:top w:w="70" w:type="dxa"/>
+              <w:left w:w="100" w:type="dxa"/>
+              <w:bottom w:w="70" w:type="dxa"/>
+              <w:right w:w="100" w:type="dxa"/>
+            </w:tcMar>
+            <w:vAlign w:val="top"/>
+          </w:tcPr>
+          <w:p>
+            <w:pPr>
+              <w:spacing w:before="0" w:after="0"/>
+            </w:pPr>
+          </w:p>
+        </w:tc>
+        <w:tc>
+          <w:tcPr>
+            <w:tcW w:w="1157" w:type="dxa"/>
+            <w:tcMar>
+              <w:top w:w="70" w:type="dxa"/>
+              <w:left w:w="100" w:type="dxa"/>
+              <w:bottom w:w="70" w:type="dxa"/>
+              <w:right w:w="100" w:type="dxa"/>
+            </w:tcMar>
+            <w:vAlign w:val="top"/>
+          </w:tcPr>
+          <w:p>
+            <w:pPr>
+              <w:spacing w:before="0" w:after="0"/>
+            </w:pPr>
+          </w:p>
+        </w:tc>
+        <w:tc>
+          <w:tcPr>
+            <w:tcW w:w="1157" w:type="dxa"/>
+            <w:tcMar>
+              <w:top w:w="70" w:type="dxa"/>
+              <w:left w:w="100" w:type="dxa"/>
+              <w:bottom w:w="70" w:type="dxa"/>
+              <w:right w:w="100" w:type="dxa"/>
+            </w:tcMar>
+            <w:vAlign w:val="top"/>
+          </w:tcPr>
+          <w:p>
+            <w:pPr>
+              <w:spacing w:before="0" w:after="0"/>
+            </w:pPr>
+          </w:p>
+        </w:tc>
+        <w:tc>
+          <w:tcPr>
+            <w:tcW w:w="1157" w:type="dxa"/>
+            <w:tcMar>
+              <w:top w:w="70" w:type="dxa"/>
+              <w:left w:w="100" w:type="dxa"/>
+              <w:bottom w:w="70" w:type="dxa"/>
+              <w:right w:w="100" w:type="dxa"/>
+            </w:tcMar>
+            <w:vAlign w:val="top"/>
+          </w:tcPr>
+          <w:p>
+            <w:pPr>
+              <w:spacing w:before="0" w:after="0"/>
+            </w:pPr>
+          </w:p>
+        </w:tc>
+        <w:tc>
+          <w:tcPr>
+            <w:tcW w:w="1157" w:type="dxa"/>
+            <w:tcMar>
+              <w:top w:w="70" w:type="dxa"/>
+              <w:left w:w="100" w:type="dxa"/>
+              <w:bottom w:w="70" w:type="dxa"/>
               <w:right w:w="100" w:type="dxa"/>
             </w:tcMar>
             <w:vAlign w:val="top"/>
@@ -1710,8 +1710,8 @@
             <w:shd w:val="clear" w:color="auto" w:fill="EDEDED"/>
             <w:tcMar>
               <w:top w:w="70" w:type="dxa"/>
-              <w:bottom w:w="70" w:type="dxa"/>
-              <w:left w:w="100" w:type="dxa"/>
+              <w:left w:w="100" w:type="dxa"/>
+              <w:bottom w:w="70" w:type="dxa"/>
               <w:right w:w="100" w:type="dxa"/>
             </w:tcMar>
             <w:vAlign w:val="top"/>
@@ -1736,127 +1736,127 @@
             <w:tcW w:w="1157" w:type="dxa"/>
             <w:tcMar>
               <w:top w:w="70" w:type="dxa"/>
-              <w:bottom w:w="70" w:type="dxa"/>
-              <w:left w:w="100" w:type="dxa"/>
-              <w:right w:w="100" w:type="dxa"/>
-            </w:tcMar>
-            <w:vAlign w:val="top"/>
-          </w:tcPr>
-          <w:p>
-            <w:pPr>
-              <w:spacing w:before="0" w:after="0"/>
-            </w:pPr>
-          </w:p>
-        </w:tc>
-        <w:tc>
-          <w:tcPr>
-            <w:tcW w:w="1157" w:type="dxa"/>
-            <w:tcMar>
-              <w:top w:w="70" w:type="dxa"/>
-              <w:bottom w:w="70" w:type="dxa"/>
-              <w:left w:w="100" w:type="dxa"/>
-              <w:right w:w="100" w:type="dxa"/>
-            </w:tcMar>
-            <w:vAlign w:val="top"/>
-          </w:tcPr>
-          <w:p>
-            <w:pPr>
-              <w:spacing w:before="0" w:after="0"/>
-            </w:pPr>
-          </w:p>
-        </w:tc>
-        <w:tc>
-          <w:tcPr>
-            <w:tcW w:w="1157" w:type="dxa"/>
-            <w:tcMar>
-              <w:top w:w="70" w:type="dxa"/>
-              <w:bottom w:w="70" w:type="dxa"/>
-              <w:left w:w="100" w:type="dxa"/>
-              <w:right w:w="100" w:type="dxa"/>
-            </w:tcMar>
-            <w:vAlign w:val="top"/>
-          </w:tcPr>
-          <w:p>
-            <w:pPr>
-              <w:spacing w:before="0" w:after="0"/>
-            </w:pPr>
-          </w:p>
-        </w:tc>
-        <w:tc>
-          <w:tcPr>
-            <w:tcW w:w="1157" w:type="dxa"/>
-            <w:tcMar>
-              <w:top w:w="70" w:type="dxa"/>
-              <w:bottom w:w="70" w:type="dxa"/>
-              <w:left w:w="100" w:type="dxa"/>
-              <w:right w:w="100" w:type="dxa"/>
-            </w:tcMar>
-            <w:vAlign w:val="top"/>
-          </w:tcPr>
-          <w:p>
-            <w:pPr>
-              <w:spacing w:before="0" w:after="0"/>
-            </w:pPr>
-          </w:p>
-        </w:tc>
-        <w:tc>
-          <w:tcPr>
-            <w:tcW w:w="1157" w:type="dxa"/>
-            <w:tcMar>
-              <w:top w:w="70" w:type="dxa"/>
-              <w:bottom w:w="70" w:type="dxa"/>
-              <w:left w:w="100" w:type="dxa"/>
-              <w:right w:w="100" w:type="dxa"/>
-            </w:tcMar>
-            <w:vAlign w:val="top"/>
-          </w:tcPr>
-          <w:p>
-            <w:pPr>
-              <w:spacing w:before="0" w:after="0"/>
-            </w:pPr>
-          </w:p>
-        </w:tc>
-        <w:tc>
-          <w:tcPr>
-            <w:tcW w:w="1157" w:type="dxa"/>
-            <w:tcMar>
-              <w:top w:w="70" w:type="dxa"/>
-              <w:bottom w:w="70" w:type="dxa"/>
-              <w:left w:w="100" w:type="dxa"/>
-              <w:right w:w="100" w:type="dxa"/>
-            </w:tcMar>
-            <w:vAlign w:val="top"/>
-          </w:tcPr>
-          <w:p>
-            <w:pPr>
-              <w:spacing w:before="0" w:after="0"/>
-            </w:pPr>
-          </w:p>
-        </w:tc>
-        <w:tc>
-          <w:tcPr>
-            <w:tcW w:w="1157" w:type="dxa"/>
-            <w:tcMar>
-              <w:top w:w="70" w:type="dxa"/>
-              <w:bottom w:w="70" w:type="dxa"/>
-              <w:left w:w="100" w:type="dxa"/>
-              <w:right w:w="100" w:type="dxa"/>
-            </w:tcMar>
-            <w:vAlign w:val="top"/>
-          </w:tcPr>
-          <w:p>
-            <w:pPr>
-              <w:spacing w:before="0" w:after="0"/>
-            </w:pPr>
-          </w:p>
-        </w:tc>
-        <w:tc>
-          <w:tcPr>
-            <w:tcW w:w="1157" w:type="dxa"/>
-            <w:tcMar>
-              <w:top w:w="70" w:type="dxa"/>
-              <w:bottom w:w="70" w:type="dxa"/>
-              <w:left w:w="100" w:type="dxa"/>
+              <w:left w:w="100" w:type="dxa"/>
+              <w:bottom w:w="70" w:type="dxa"/>
+              <w:right w:w="100" w:type="dxa"/>
+            </w:tcMar>
+            <w:vAlign w:val="top"/>
+          </w:tcPr>
+          <w:p>
+            <w:pPr>
+              <w:spacing w:before="0" w:after="0"/>
+            </w:pPr>
+          </w:p>
+        </w:tc>
+        <w:tc>
+          <w:tcPr>
+            <w:tcW w:w="1157" w:type="dxa"/>
+            <w:tcMar>
+              <w:top w:w="70" w:type="dxa"/>
+              <w:left w:w="100" w:type="dxa"/>
+              <w:bottom w:w="70" w:type="dxa"/>
+              <w:right w:w="100" w:type="dxa"/>
+            </w:tcMar>
+            <w:vAlign w:val="top"/>
+          </w:tcPr>
+          <w:p>
+            <w:pPr>
+              <w:spacing w:before="0" w:after="0"/>
+            </w:pPr>
+          </w:p>
+        </w:tc>
+        <w:tc>
+          <w:tcPr>
+            <w:tcW w:w="1157" w:type="dxa"/>
+            <w:tcMar>
+              <w:top w:w="70" w:type="dxa"/>
+              <w:left w:w="100" w:type="dxa"/>
+              <w:bottom w:w="70" w:type="dxa"/>
+              <w:right w:w="100" w:type="dxa"/>
+            </w:tcMar>
+            <w:vAlign w:val="top"/>
+          </w:tcPr>
+          <w:p>
+            <w:pPr>
+              <w:spacing w:before="0" w:after="0"/>
+            </w:pPr>
+          </w:p>
+        </w:tc>
+        <w:tc>
+          <w:tcPr>
+            <w:tcW w:w="1157" w:type="dxa"/>
+            <w:tcMar>
+              <w:top w:w="70" w:type="dxa"/>
+              <w:left w:w="100" w:type="dxa"/>
+              <w:bottom w:w="70" w:type="dxa"/>
+              <w:right w:w="100" w:type="dxa"/>
+            </w:tcMar>
+            <w:vAlign w:val="top"/>
+          </w:tcPr>
+          <w:p>
+            <w:pPr>
+              <w:spacing w:before="0" w:after="0"/>
+            </w:pPr>
+          </w:p>
+        </w:tc>
+        <w:tc>
+          <w:tcPr>
+            <w:tcW w:w="1157" w:type="dxa"/>
+            <w:tcMar>
+              <w:top w:w="70" w:type="dxa"/>
+              <w:left w:w="100" w:type="dxa"/>
+              <w:bottom w:w="70" w:type="dxa"/>
+              <w:right w:w="100" w:type="dxa"/>
+            </w:tcMar>
+            <w:vAlign w:val="top"/>
+          </w:tcPr>
+          <w:p>
+            <w:pPr>
+              <w:spacing w:before="0" w:after="0"/>
+            </w:pPr>
+          </w:p>
+        </w:tc>
+        <w:tc>
+          <w:tcPr>
+            <w:tcW w:w="1157" w:type="dxa"/>
+            <w:tcMar>
+              <w:top w:w="70" w:type="dxa"/>
+              <w:left w:w="100" w:type="dxa"/>
+              <w:bottom w:w="70" w:type="dxa"/>
+              <w:right w:w="100" w:type="dxa"/>
+            </w:tcMar>
+            <w:vAlign w:val="top"/>
+          </w:tcPr>
+          <w:p>
+            <w:pPr>
+              <w:spacing w:before="0" w:after="0"/>
+            </w:pPr>
+          </w:p>
+        </w:tc>
+        <w:tc>
+          <w:tcPr>
+            <w:tcW w:w="1157" w:type="dxa"/>
+            <w:tcMar>
+              <w:top w:w="70" w:type="dxa"/>
+              <w:left w:w="100" w:type="dxa"/>
+              <w:bottom w:w="70" w:type="dxa"/>
+              <w:right w:w="100" w:type="dxa"/>
+            </w:tcMar>
+            <w:vAlign w:val="top"/>
+          </w:tcPr>
+          <w:p>
+            <w:pPr>
+              <w:spacing w:before="0" w:after="0"/>
+            </w:pPr>
+          </w:p>
+        </w:tc>
+        <w:tc>
+          <w:tcPr>
+            <w:tcW w:w="1157" w:type="dxa"/>
+            <w:tcMar>
+              <w:top w:w="70" w:type="dxa"/>
+              <w:left w:w="100" w:type="dxa"/>
+              <w:bottom w:w="70" w:type="dxa"/>
               <w:right w:w="100" w:type="dxa"/>
             </w:tcMar>
             <w:vAlign w:val="top"/>
@@ -1878,8 +1878,8 @@
             <w:shd w:val="clear" w:color="auto" w:fill="EDEDED"/>
             <w:tcMar>
               <w:top w:w="70" w:type="dxa"/>
-              <w:bottom w:w="70" w:type="dxa"/>
-              <w:left w:w="100" w:type="dxa"/>
+              <w:left w:w="100" w:type="dxa"/>
+              <w:bottom w:w="70" w:type="dxa"/>
               <w:right w:w="100" w:type="dxa"/>
             </w:tcMar>
             <w:vAlign w:val="top"/>
@@ -1904,127 +1904,127 @@
             <w:tcW w:w="1157" w:type="dxa"/>
             <w:tcMar>
               <w:top w:w="70" w:type="dxa"/>
-              <w:bottom w:w="70" w:type="dxa"/>
-              <w:left w:w="100" w:type="dxa"/>
-              <w:right w:w="100" w:type="dxa"/>
-            </w:tcMar>
-            <w:vAlign w:val="top"/>
-          </w:tcPr>
-          <w:p>
-            <w:pPr>
-              <w:spacing w:before="0" w:after="0"/>
-            </w:pPr>
-          </w:p>
-        </w:tc>
-        <w:tc>
-          <w:tcPr>
-            <w:tcW w:w="1157" w:type="dxa"/>
-            <w:tcMar>
-              <w:top w:w="70" w:type="dxa"/>
-              <w:bottom w:w="70" w:type="dxa"/>
-              <w:left w:w="100" w:type="dxa"/>
-              <w:right w:w="100" w:type="dxa"/>
-            </w:tcMar>
-            <w:vAlign w:val="top"/>
-          </w:tcPr>
-          <w:p>
-            <w:pPr>
-              <w:spacing w:before="0" w:after="0"/>
-            </w:pPr>
-          </w:p>
-        </w:tc>
-        <w:tc>
-          <w:tcPr>
-            <w:tcW w:w="1157" w:type="dxa"/>
-            <w:tcMar>
-              <w:top w:w="70" w:type="dxa"/>
-              <w:bottom w:w="70" w:type="dxa"/>
-              <w:left w:w="100" w:type="dxa"/>
-              <w:right w:w="100" w:type="dxa"/>
-            </w:tcMar>
-            <w:vAlign w:val="top"/>
-          </w:tcPr>
-          <w:p>
-            <w:pPr>
-              <w:spacing w:before="0" w:after="0"/>
-            </w:pPr>
-          </w:p>
-        </w:tc>
-        <w:tc>
-          <w:tcPr>
-            <w:tcW w:w="1157" w:type="dxa"/>
-            <w:tcMar>
-              <w:top w:w="70" w:type="dxa"/>
-              <w:bottom w:w="70" w:type="dxa"/>
-              <w:left w:w="100" w:type="dxa"/>
-              <w:right w:w="100" w:type="dxa"/>
-            </w:tcMar>
-            <w:vAlign w:val="top"/>
-          </w:tcPr>
-          <w:p>
-            <w:pPr>
-              <w:spacing w:before="0" w:after="0"/>
-            </w:pPr>
-          </w:p>
-        </w:tc>
-        <w:tc>
-          <w:tcPr>
-            <w:tcW w:w="1157" w:type="dxa"/>
-            <w:tcMar>
-              <w:top w:w="70" w:type="dxa"/>
-              <w:bottom w:w="70" w:type="dxa"/>
-              <w:left w:w="100" w:type="dxa"/>
-              <w:right w:w="100" w:type="dxa"/>
-            </w:tcMar>
-            <w:vAlign w:val="top"/>
-          </w:tcPr>
-          <w:p>
-            <w:pPr>
-              <w:spacing w:before="0" w:after="0"/>
-            </w:pPr>
-          </w:p>
-        </w:tc>
-        <w:tc>
-          <w:tcPr>
-            <w:tcW w:w="1157" w:type="dxa"/>
-            <w:tcMar>
-              <w:top w:w="70" w:type="dxa"/>
-              <w:bottom w:w="70" w:type="dxa"/>
-              <w:left w:w="100" w:type="dxa"/>
-              <w:right w:w="100" w:type="dxa"/>
-            </w:tcMar>
-            <w:vAlign w:val="top"/>
-          </w:tcPr>
-          <w:p>
-            <w:pPr>
-              <w:spacing w:before="0" w:after="0"/>
-            </w:pPr>
-          </w:p>
-        </w:tc>
-        <w:tc>
-          <w:tcPr>
-            <w:tcW w:w="1157" w:type="dxa"/>
-            <w:tcMar>
-              <w:top w:w="70" w:type="dxa"/>
-              <w:bottom w:w="70" w:type="dxa"/>
-              <w:left w:w="100" w:type="dxa"/>
-              <w:right w:w="100" w:type="dxa"/>
-            </w:tcMar>
-            <w:vAlign w:val="top"/>
-          </w:tcPr>
-          <w:p>
-            <w:pPr>
-              <w:spacing w:before="0" w:after="0"/>
-            </w:pPr>
-          </w:p>
-        </w:tc>
-        <w:tc>
-          <w:tcPr>
-            <w:tcW w:w="1157" w:type="dxa"/>
-            <w:tcMar>
-              <w:top w:w="70" w:type="dxa"/>
-              <w:bottom w:w="70" w:type="dxa"/>
-              <w:left w:w="100" w:type="dxa"/>
+              <w:left w:w="100" w:type="dxa"/>
+              <w:bottom w:w="70" w:type="dxa"/>
+              <w:right w:w="100" w:type="dxa"/>
+            </w:tcMar>
+            <w:vAlign w:val="top"/>
+          </w:tcPr>
+          <w:p>
+            <w:pPr>
+              <w:spacing w:before="0" w:after="0"/>
+            </w:pPr>
+          </w:p>
+        </w:tc>
+        <w:tc>
+          <w:tcPr>
+            <w:tcW w:w="1157" w:type="dxa"/>
+            <w:tcMar>
+              <w:top w:w="70" w:type="dxa"/>
+              <w:left w:w="100" w:type="dxa"/>
+              <w:bottom w:w="70" w:type="dxa"/>
+              <w:right w:w="100" w:type="dxa"/>
+            </w:tcMar>
+            <w:vAlign w:val="top"/>
+          </w:tcPr>
+          <w:p>
+            <w:pPr>
+              <w:spacing w:before="0" w:after="0"/>
+            </w:pPr>
+          </w:p>
+        </w:tc>
+        <w:tc>
+          <w:tcPr>
+            <w:tcW w:w="1157" w:type="dxa"/>
+            <w:tcMar>
+              <w:top w:w="70" w:type="dxa"/>
+              <w:left w:w="100" w:type="dxa"/>
+              <w:bottom w:w="70" w:type="dxa"/>
+              <w:right w:w="100" w:type="dxa"/>
+            </w:tcMar>
+            <w:vAlign w:val="top"/>
+          </w:tcPr>
+          <w:p>
+            <w:pPr>
+              <w:spacing w:before="0" w:after="0"/>
+            </w:pPr>
+          </w:p>
+        </w:tc>
+        <w:tc>
+          <w:tcPr>
+            <w:tcW w:w="1157" w:type="dxa"/>
+            <w:tcMar>
+              <w:top w:w="70" w:type="dxa"/>
+              <w:left w:w="100" w:type="dxa"/>
+              <w:bottom w:w="70" w:type="dxa"/>
+              <w:right w:w="100" w:type="dxa"/>
+            </w:tcMar>
+            <w:vAlign w:val="top"/>
+          </w:tcPr>
+          <w:p>
+            <w:pPr>
+              <w:spacing w:before="0" w:after="0"/>
+            </w:pPr>
+          </w:p>
+        </w:tc>
+        <w:tc>
+          <w:tcPr>
+            <w:tcW w:w="1157" w:type="dxa"/>
+            <w:tcMar>
+              <w:top w:w="70" w:type="dxa"/>
+              <w:left w:w="100" w:type="dxa"/>
+              <w:bottom w:w="70" w:type="dxa"/>
+              <w:right w:w="100" w:type="dxa"/>
+            </w:tcMar>
+            <w:vAlign w:val="top"/>
+          </w:tcPr>
+          <w:p>
+            <w:pPr>
+              <w:spacing w:before="0" w:after="0"/>
+            </w:pPr>
+          </w:p>
+        </w:tc>
+        <w:tc>
+          <w:tcPr>
+            <w:tcW w:w="1157" w:type="dxa"/>
+            <w:tcMar>
+              <w:top w:w="70" w:type="dxa"/>
+              <w:left w:w="100" w:type="dxa"/>
+              <w:bottom w:w="70" w:type="dxa"/>
+              <w:right w:w="100" w:type="dxa"/>
+            </w:tcMar>
+            <w:vAlign w:val="top"/>
+          </w:tcPr>
+          <w:p>
+            <w:pPr>
+              <w:spacing w:before="0" w:after="0"/>
+            </w:pPr>
+          </w:p>
+        </w:tc>
+        <w:tc>
+          <w:tcPr>
+            <w:tcW w:w="1157" w:type="dxa"/>
+            <w:tcMar>
+              <w:top w:w="70" w:type="dxa"/>
+              <w:left w:w="100" w:type="dxa"/>
+              <w:bottom w:w="70" w:type="dxa"/>
+              <w:right w:w="100" w:type="dxa"/>
+            </w:tcMar>
+            <w:vAlign w:val="top"/>
+          </w:tcPr>
+          <w:p>
+            <w:pPr>
+              <w:spacing w:before="0" w:after="0"/>
+            </w:pPr>
+          </w:p>
+        </w:tc>
+        <w:tc>
+          <w:tcPr>
+            <w:tcW w:w="1157" w:type="dxa"/>
+            <w:tcMar>
+              <w:top w:w="70" w:type="dxa"/>
+              <w:left w:w="100" w:type="dxa"/>
+              <w:bottom w:w="70" w:type="dxa"/>
               <w:right w:w="100" w:type="dxa"/>
             </w:tcMar>
             <w:vAlign w:val="top"/>
@@ -2156,7 +2156,6 @@
     <w:tbl>
       <w:tblPr>
         <w:tblW w:w="9638" w:type="dxa"/>
-        <w:tblLayout w:type="fixed"/>
         <w:tblBorders>
           <w:top w:val="single" w:sz="4" w:space="0" w:color="E4E6EB"/>
           <w:left w:val="nil" w:sz="4" w:space="0" w:color="E4E6EB"/>
@@ -2165,6 +2164,7 @@
           <w:insideH w:val="single" w:sz="4" w:space="0" w:color="E4E6EB"/>
           <w:insideV w:val="nil" w:sz="4" w:space="0" w:color="E4E6EB"/>
         </w:tblBorders>
+        <w:tblLayout w:type="fixed"/>
         <w:tblLook w:val="04A0" w:firstRow="1" w:lastRow="0" w:firstColumn="0" w:lastColumn="0" w:noHBand="1" w:noVBand="1"/>
       </w:tblPr>
       <w:tblGrid>
@@ -2180,8 +2180,8 @@
             <w:tcW w:w="1500" w:type="dxa"/>
             <w:tcMar>
               <w:top w:w="70" w:type="dxa"/>
-              <w:bottom w:w="70" w:type="dxa"/>
-              <w:left w:w="100" w:type="dxa"/>
+              <w:left w:w="100" w:type="dxa"/>
+              <w:bottom w:w="70" w:type="dxa"/>
               <w:right w:w="100" w:type="dxa"/>
             </w:tcMar>
             <w:vAlign w:val="top"/>
@@ -2206,8 +2206,8 @@
             <w:tcW w:w="8138" w:type="dxa"/>
             <w:tcMar>
               <w:top w:w="70" w:type="dxa"/>
-              <w:bottom w:w="70" w:type="dxa"/>
-              <w:left w:w="100" w:type="dxa"/>
+              <w:left w:w="100" w:type="dxa"/>
+              <w:bottom w:w="70" w:type="dxa"/>
               <w:right w:w="100" w:type="dxa"/>
             </w:tcMar>
             <w:vAlign w:val="top"/>
@@ -2236,8 +2236,8 @@
             <w:tcW w:w="1500" w:type="dxa"/>
             <w:tcMar>
               <w:top w:w="70" w:type="dxa"/>
-              <w:bottom w:w="70" w:type="dxa"/>
-              <w:left w:w="100" w:type="dxa"/>
+              <w:left w:w="100" w:type="dxa"/>
+              <w:bottom w:w="70" w:type="dxa"/>
               <w:right w:w="100" w:type="dxa"/>
             </w:tcMar>
             <w:vAlign w:val="top"/>
@@ -2262,8 +2262,8 @@
             <w:tcW w:w="8138" w:type="dxa"/>
             <w:tcMar>
               <w:top w:w="70" w:type="dxa"/>
-              <w:bottom w:w="70" w:type="dxa"/>
-              <w:left w:w="100" w:type="dxa"/>
+              <w:left w:w="100" w:type="dxa"/>
+              <w:bottom w:w="70" w:type="dxa"/>
               <w:right w:w="100" w:type="dxa"/>
             </w:tcMar>
             <w:vAlign w:val="top"/>
@@ -2292,8 +2292,8 @@
             <w:tcW w:w="1500" w:type="dxa"/>
             <w:tcMar>
               <w:top w:w="70" w:type="dxa"/>
-              <w:bottom w:w="70" w:type="dxa"/>
-              <w:left w:w="100" w:type="dxa"/>
+              <w:left w:w="100" w:type="dxa"/>
+              <w:bottom w:w="70" w:type="dxa"/>
               <w:right w:w="100" w:type="dxa"/>
             </w:tcMar>
             <w:vAlign w:val="top"/>
@@ -2318,8 +2318,8 @@
             <w:tcW w:w="8138" w:type="dxa"/>
             <w:tcMar>
               <w:top w:w="70" w:type="dxa"/>
-              <w:bottom w:w="70" w:type="dxa"/>
-              <w:left w:w="100" w:type="dxa"/>
+              <w:left w:w="100" w:type="dxa"/>
+              <w:bottom w:w="70" w:type="dxa"/>
               <w:right w:w="100" w:type="dxa"/>
             </w:tcMar>
             <w:vAlign w:val="top"/>
@@ -2348,8 +2348,8 @@
             <w:tcW w:w="1500" w:type="dxa"/>
             <w:tcMar>
               <w:top w:w="70" w:type="dxa"/>
-              <w:bottom w:w="70" w:type="dxa"/>
-              <w:left w:w="100" w:type="dxa"/>
+              <w:left w:w="100" w:type="dxa"/>
+              <w:bottom w:w="70" w:type="dxa"/>
               <w:right w:w="100" w:type="dxa"/>
             </w:tcMar>
             <w:vAlign w:val="top"/>
@@ -2374,8 +2374,8 @@
             <w:tcW w:w="8138" w:type="dxa"/>
             <w:tcMar>
               <w:top w:w="70" w:type="dxa"/>
-              <w:bottom w:w="70" w:type="dxa"/>
-              <w:left w:w="100" w:type="dxa"/>
+              <w:left w:w="100" w:type="dxa"/>
+              <w:bottom w:w="70" w:type="dxa"/>
               <w:right w:w="100" w:type="dxa"/>
             </w:tcMar>
             <w:vAlign w:val="top"/>
@@ -2404,8 +2404,8 @@
             <w:tcW w:w="1500" w:type="dxa"/>
             <w:tcMar>
               <w:top w:w="70" w:type="dxa"/>
-              <w:bottom w:w="70" w:type="dxa"/>
-              <w:left w:w="100" w:type="dxa"/>
+              <w:left w:w="100" w:type="dxa"/>
+              <w:bottom w:w="70" w:type="dxa"/>
               <w:right w:w="100" w:type="dxa"/>
             </w:tcMar>
             <w:vAlign w:val="top"/>
@@ -2430,8 +2430,8 @@
             <w:tcW w:w="8138" w:type="dxa"/>
             <w:tcMar>
               <w:top w:w="70" w:type="dxa"/>
-              <w:bottom w:w="70" w:type="dxa"/>
-              <w:left w:w="100" w:type="dxa"/>
+              <w:left w:w="100" w:type="dxa"/>
+              <w:bottom w:w="70" w:type="dxa"/>
               <w:right w:w="100" w:type="dxa"/>
             </w:tcMar>
             <w:vAlign w:val="top"/>
@@ -2755,7 +2755,6 @@
     <w:tbl>
       <w:tblPr>
         <w:tblW w:w="9638" w:type="dxa"/>
-        <w:tblLayout w:type="fixed"/>
         <w:tblBorders>
           <w:top w:val="single" w:sz="4" w:space="0" w:color="E4E1D8"/>
           <w:left w:val="single" w:sz="4" w:space="0" w:color="E4E1D8"/>
@@ -2764,6 +2763,7 @@
           <w:insideH w:val="single" w:sz="4" w:space="0" w:color="E4E1D8"/>
           <w:insideV w:val="single" w:sz="4" w:space="0" w:color="E4E1D8"/>
         </w:tblBorders>
+        <w:tblLayout w:type="fixed"/>
         <w:tblLook w:val="04A0" w:firstRow="1" w:lastRow="0" w:firstColumn="0" w:lastColumn="0" w:noHBand="1" w:noVBand="1"/>
       </w:tblPr>
       <w:tblGrid>
@@ -2780,8 +2780,8 @@
             <w:shd w:val="clear" w:color="auto" w:fill="F6F4EE"/>
             <w:tcMar>
               <w:top w:w="140" w:type="dxa"/>
+              <w:left w:w="100" w:type="dxa"/>
               <w:bottom w:w="140" w:type="dxa"/>
-              <w:left w:w="100" w:type="dxa"/>
               <w:right w:w="100" w:type="dxa"/>
             </w:tcMar>
             <w:vAlign w:val="center"/>
@@ -2807,8 +2807,8 @@
             <w:tcW w:w="7038" w:type="dxa"/>
             <w:tcMar>
               <w:top w:w="140" w:type="dxa"/>
+              <w:left w:w="100" w:type="dxa"/>
               <w:bottom w:w="140" w:type="dxa"/>
-              <w:left w:w="100" w:type="dxa"/>
               <w:right w:w="100" w:type="dxa"/>
             </w:tcMar>
             <w:vAlign w:val="center"/>
@@ -2838,8 +2838,8 @@
             <w:shd w:val="clear" w:color="auto" w:fill="F6F4EE"/>
             <w:tcMar>
               <w:top w:w="140" w:type="dxa"/>
+              <w:left w:w="100" w:type="dxa"/>
               <w:bottom w:w="140" w:type="dxa"/>
-              <w:left w:w="100" w:type="dxa"/>
               <w:right w:w="100" w:type="dxa"/>
             </w:tcMar>
             <w:vAlign w:val="center"/>
@@ -2865,8 +2865,8 @@
             <w:tcW w:w="7038" w:type="dxa"/>
             <w:tcMar>
               <w:top w:w="140" w:type="dxa"/>
+              <w:left w:w="100" w:type="dxa"/>
               <w:bottom w:w="140" w:type="dxa"/>
-              <w:left w:w="100" w:type="dxa"/>
               <w:right w:w="100" w:type="dxa"/>
             </w:tcMar>
             <w:vAlign w:val="center"/>
@@ -2896,8 +2896,8 @@
             <w:shd w:val="clear" w:color="auto" w:fill="F6F4EE"/>
             <w:tcMar>
               <w:top w:w="140" w:type="dxa"/>
+              <w:left w:w="100" w:type="dxa"/>
               <w:bottom w:w="140" w:type="dxa"/>
-              <w:left w:w="100" w:type="dxa"/>
               <w:right w:w="100" w:type="dxa"/>
             </w:tcMar>
             <w:vAlign w:val="center"/>
@@ -2923,8 +2923,8 @@
             <w:tcW w:w="7038" w:type="dxa"/>
             <w:tcMar>
               <w:top w:w="140" w:type="dxa"/>
+              <w:left w:w="100" w:type="dxa"/>
               <w:bottom w:w="140" w:type="dxa"/>
-              <w:left w:w="100" w:type="dxa"/>
               <w:right w:w="100" w:type="dxa"/>
             </w:tcMar>
             <w:vAlign w:val="center"/>
@@ -2976,8 +2976,8 @@
             <w:shd w:val="clear" w:color="auto" w:fill="F6F4EE"/>
             <w:tcMar>
               <w:top w:w="140" w:type="dxa"/>
+              <w:left w:w="100" w:type="dxa"/>
               <w:bottom w:w="140" w:type="dxa"/>
-              <w:left w:w="100" w:type="dxa"/>
               <w:right w:w="100" w:type="dxa"/>
             </w:tcMar>
             <w:vAlign w:val="center"/>
@@ -3003,8 +3003,8 @@
             <w:tcW w:w="7038" w:type="dxa"/>
             <w:tcMar>
               <w:top w:w="140" w:type="dxa"/>
+              <w:left w:w="100" w:type="dxa"/>
               <w:bottom w:w="140" w:type="dxa"/>
-              <w:left w:w="100" w:type="dxa"/>
               <w:right w:w="100" w:type="dxa"/>
             </w:tcMar>
             <w:vAlign w:val="center"/>
@@ -3034,8 +3034,8 @@
             <w:shd w:val="clear" w:color="auto" w:fill="F6F4EE"/>
             <w:tcMar>
               <w:top w:w="140" w:type="dxa"/>
+              <w:left w:w="100" w:type="dxa"/>
               <w:bottom w:w="140" w:type="dxa"/>
-              <w:left w:w="100" w:type="dxa"/>
               <w:right w:w="100" w:type="dxa"/>
             </w:tcMar>
             <w:vAlign w:val="center"/>
@@ -3061,8 +3061,8 @@
             <w:tcW w:w="7038" w:type="dxa"/>
             <w:tcMar>
               <w:top w:w="140" w:type="dxa"/>
+              <w:left w:w="100" w:type="dxa"/>
               <w:bottom w:w="140" w:type="dxa"/>
-              <w:left w:w="100" w:type="dxa"/>
               <w:right w:w="100" w:type="dxa"/>
             </w:tcMar>
             <w:vAlign w:val="center"/>

</xml_diff>